<commit_message>
Feat: Add K-Culture and K-Goods 1-Click product spec planning to dashboard & presentation script
</commit_message>
<xml_diff>
--- a/K_Culture_Survey_Presentation_Script.docx
+++ b/K_Culture_Survey_Presentation_Script.docx
@@ -1499,7 +1499,7 @@
                 <w:sz w:val="19"/>
                 <w:rFonts w:ascii="맑은 고딕" w:hAnsi="맑은 고딕" w:eastAsia="맑은 고딕"/>
               </w:rPr>
-              <w:t>Action 1, Action 2, Action 3 카드 3개로 구성된 전략 제언 화면</w:t>
+              <w:t>Action 1(Z세대 K-Pop 굿즈/핫플), Action 2(K-뷰티/스킨케어 융합), Action 3(FanPass 재방문 혜택) 카드 화면</w:t>
             </w:r>
           </w:p>
         </w:tc>
@@ -1533,7 +1533,7 @@
                 <w:sz w:val="19"/>
                 <w:rFonts w:ascii="맑은 고딕" w:hAnsi="맑은 고딕" w:eastAsia="맑은 고딕"/>
               </w:rPr>
-              <w:t>목소리에 힘을 주어 해결책을 자신감 있게 발표합니다.</w:t>
+              <w:t>목소리에 힘을 주어 현업 상품화 전략을 자신감 있게 발표합니다.</w:t>
             </w:r>
           </w:p>
         </w:tc>
@@ -1566,19 +1566,19 @@
         <w:t>“이에 저희 팀은 2026년을 향한 3대 전략적 액션 플랜(Action Items)을 제언합니다. 10번 슬라이드입니다.</w:t>
         <w:br/>
         <w:br/>
-        <w:t>ACTION 1: 일본/대만 15-29세 타깃 '2박 3일 초밀도 K-체험 패키지' 개발</w:t>
+        <w:t>ACTION 1: 일본/대만 1020 타깃 'LCC + 성수동 핫플 + K-Pop 굿즈 2박3일 초밀도 패키지' 개발</w:t>
         <w:br/>
-        <w:t>체재일수가 가장 짧은 일본(-7.6일)과 대만(-6.2일) 청년층을 위해, 성수동 로드숍, K-Pop 안무 클래스, 인스타 핫플을 묶은 2박 3일 고밀도 코스를 제공해 단기 체재의 한계를 극복해야 합니다.</w:t>
+        <w:t>체재일수가 짧은 일본(-7.6일)과 대만(-6.2일) Z세대를 위해 성수동 로드숍, K-Pop 앨범/굿즈 바우처, 안무 원데이 클래스를 묶은 초밀도 코스를 제공합니다.</w:t>
         <w:br/>
         <w:br/>
-        <w:t>ACTION 2: 중국/동남아 2030 타깃 'K-뷰티 + 미식 융합 프리미엄 상품'</w:t>
+        <w:t>ACTION 2: 중국 30대 타깃 '강남 VIP K-뷰티 + 미쉐린 K-푸드 융합 상품'</w:t>
         <w:br/>
-        <w:t>피부과/메이크업 체험과 미쉐린 K-푸드 투어를 결합하여 1인당 지출 단가를 대폭 끌어올려야 합니다.</w:t>
+        <w:t>피부과 VIP 스킨케어, 퍼스널 컬러 및 K-뷰티 화장품 굿즈 세트를 결합하여 1인당 지출 단가를 대폭 끌어올려야 합니다.</w:t>
         <w:br/>
         <w:br/>
-        <w:t>ACTION 3: LCC(저비용항공사) 연계 A/B 결합 패키지</w:t>
+        <w:t>ACTION 3: FanPass K-굿즈 연계 재예약 CRM 실험</w:t>
         <w:br/>
-        <w:t>개별여행(FIT) 비중이 높은 젊은 층을 위해, 항공권과 공연 티켓, 시내면세점 할인 쿠폰을 하나로 묶은 통합 바우처를 제공하는 것입니다.”</w:t>
+        <w:t>귀국 후 K-Goods 역직구몰 20% 전용 할인 쿠폰과 재방문 시 'K-시크릿 굿즈 웰컴박스'를 제공하여 6~12개월 내 재예약을 유도합니다.”</w:t>
       </w:r>
     </w:p>
     <w:p>
@@ -1603,7 +1603,7 @@
           <w:sz w:val="19"/>
           <w:rFonts w:ascii="맑은 고딕" w:hAnsi="맑은 고딕" w:eastAsia="맑은 고딕"/>
         </w:rPr>
-        <w:t>① 일본/대만 2박3일 밀도높은 K-체험, ② 중국/동남아 뷰티+미식 융합, ③ LCC 연계 통합 바우처 제공.</w:t>
+        <w:t>① 일본/대만 K-Pop 굿즈&amp;체험 2박3일, ② 중국 K-뷰티+미식 융합, ③ 귀국 후 FanPass K-굿즈 연계 재예약 실험.</w:t>
       </w:r>
     </w:p>
     <w:p/>
@@ -1619,7 +1619,7 @@
           <w:sz w:val="28"/>
           <w:rFonts w:ascii="맑은 고딕" w:hAnsi="맑은 고딕" w:eastAsia="맑은 고딕"/>
         </w:rPr>
-        <w:t>슬라이드 11. 대시보드 시스템 구축 (Dashboard System)</w:t>
+        <w:t>슬라이드 11. 3초 만에 완성하는 K-컬처·굿즈 맞춤 상품기획 솔루션 (Dashboard Solution)</w:t>
       </w:r>
     </w:p>
     <w:tbl>
@@ -1662,7 +1662,7 @@
                 <w:sz w:val="19"/>
                 <w:rFonts w:ascii="맑은 고딕" w:hAnsi="맑은 고딕" w:eastAsia="맑은 고딕"/>
               </w:rPr>
-              <w:t>구축된 K-컬처 데이터 대시보드(index.html) UI 캡처 화면</w:t>
+              <w:t>1-Click K-굿즈 &amp; 패키지 기획서 자동 추출 대시보드(index.html) 시연 화면</w:t>
             </w:r>
           </w:p>
         </w:tc>
@@ -1696,7 +1696,7 @@
                 <w:sz w:val="19"/>
                 <w:rFonts w:ascii="맑은 고딕" w:hAnsi="맑은 고딕" w:eastAsia="맑은 고딕"/>
               </w:rPr>
-              <w:t>대시보드가 실용적임을 강조하며 미소를 띱니다.</w:t>
+              <w:t>자연스러운 미소와 자신감 넘치는 목소리로 "실무 솔루션"임을 강조합니다.</w:t>
             </w:r>
           </w:p>
         </w:tc>
@@ -1726,13 +1726,13 @@
           <w:sz w:val="21"/>
           <w:rFonts w:ascii="맑은 고딕" w:hAnsi="맑은 고딕" w:eastAsia="맑은 고딕"/>
         </w:rPr>
-        <w:t>“11번 슬라이드는 저희가 실제로 구현한 'K-컬처 관광 실시간 분석 대시보드' 시스템입니다.</w:t>
+        <w:t>“11번 슬라이드는 앞서 제시한 전략을 실무에서 즉시 실행할 수 있는 'K-컬처 1030 핀포인트 상품기획 대시보드'입니다.</w:t>
         <w:br/>
         <w:br/>
-        <w:t>앞서 말씀드린 3만 명의 데이터를 바탕으로, 연도별, 국적별, 연령대별로 K-컬처 관여율, 체재일수 갭, 지출 항목을 클릭 한 번으로 실시간 비교·분석할 수 있는 웹 대시보드를 구축했습니다.</w:t>
+        <w:t>그렇다면 현업 여행사 마케터들이 매번 이 방대한 원시 데이터를 직접 분석해야 할까요? 그렇지 않습니다.</w:t>
         <w:br/>
         <w:br/>
-        <w:t>이를 통해 마케팅 담당자들은 2026년 신규 수립될 관광 정책의 성과를 데이터 기반으로 실시간 모니터링할 수 있게 됩니다.”</w:t>
+        <w:t>저희 대시보드에서는 마케터가 4대 페르소나(체크인 팝스타, VIP 뷰티퀸 등) 중 원하는 타깃을 선택하고 [기획서 생성] 버튼만 누르면, K-Pop 굿즈 바우처($50) 및 K-뷰티 혜택이 포함된 1-Click 상품기획서가 3초 만에 자동 추출됩니다.”</w:t>
       </w:r>
     </w:p>
     <w:p>
@@ -1757,7 +1757,7 @@
           <w:sz w:val="19"/>
           <w:rFonts w:ascii="맑은 고딕" w:hAnsi="맑은 고딕" w:eastAsia="맑은 고딕"/>
         </w:rPr>
-        <w:t>실시간으로 국적·연령별 K-컬처 관광 특성을 분석할 수 있는 웹 대시보드를 구축 완료했다.</w:t>
+        <w:t>마케터가 버튼 하나로 K-굿즈 바우처 &amp; 4대 페르소나별 패키지 기획서를 3초 만에 추출할 수 있는 대시보드를 구축했다.</w:t>
       </w:r>
     </w:p>
     <w:p/>
@@ -1773,7 +1773,7 @@
           <w:sz w:val="28"/>
           <w:rFonts w:ascii="맑은 고딕" w:hAnsi="맑은 고딕" w:eastAsia="맑은 고딕"/>
         </w:rPr>
-        <w:t>슬라이드 12. 데이터 처리 및 분석 방법론 (Data Pipeline)</w:t>
+        <w:t>슬라이드 12. 분석 결과부터 1-Click K-굿즈 기획서까지 (Product Workflow)</w:t>
       </w:r>
     </w:p>
     <w:tbl>
@@ -1816,7 +1816,7 @@
                 <w:sz w:val="19"/>
                 <w:rFonts w:ascii="맑은 고딕" w:hAnsi="맑은 고딕" w:eastAsia="맑은 고딕"/>
               </w:rPr>
-              <w:t>analyze.py ➔ CSV/JS ➔ 대시보드/PPT로 이어지는 데이터 정합성 파이프라인</w:t>
+              <w:t>1. 데이터 인사이트 ➔ 2. 페르소나 핀포인트 ➔ 3. 1-Click 기획서 자동 추출로 이어지는 워크플로우</w:t>
             </w:r>
           </w:p>
         </w:tc>
@@ -1850,7 +1850,7 @@
                 <w:sz w:val="19"/>
                 <w:rFonts w:ascii="맑은 고딕" w:hAnsi="맑은 고딕" w:eastAsia="맑은 고딕"/>
               </w:rPr>
-              <w:t>차분하고 전문성 있는 어조로 데이터 정밀성을 설명합니다.</w:t>
+              <w:t>차분하고 전문성 있는 어조로 데이터와 실무 기획의 연계성을 설명합니다.</w:t>
             </w:r>
           </w:p>
         </w:tc>
@@ -1880,13 +1880,14 @@
           <w:sz w:val="21"/>
           <w:rFonts w:ascii="맑은 고딕" w:hAnsi="맑은 고딕" w:eastAsia="맑은 고딕"/>
         </w:rPr>
-        <w:t>“12번 슬라이드는 데이터 정합성 검증 절차입니다.</w:t>
+        <w:t>“12번 슬라이드는 데이터 분석이 어떻게 실제 여행상품 기획으로 연결되는지 보여주는 3단계 워크플로우입니다.</w:t>
         <w:br/>
         <w:br/>
-        <w:t>저희는 2023, 2024, 2025년 엑셀 원시 데이터부터 출발하여 파이썬(analyze.py) 파이프라인을 구축해 수치 검증을 완료했습니다.</w:t>
+        <w:t>첫째, 메인 대시보드에서 K-컬처·굿즈 고관여층의 행동 특성을 데이터로 확인합니다.</w:t>
         <w:br/>
+        <w:t>둘째, 4대 핵심 페르소나별 선호 굿즈(K-Pop, K-뷰티 등) 및 일정을 매칭합니다.</w:t>
         <w:br/>
-        <w:t>데이터의 오류나 누락 없이 정확한 수치만을 선별하여 대시보드와 이번 발표 자료에 반영했음을 말씀드립니다.”</w:t>
+        <w:t>셋째, 1-Click 기획서 자동 추출을 통해 현업에서 바로 사용할 파일럿 상품안과 FanPass CRM 쿠폰 혜택을 즉시 완성합니다.”</w:t>
       </w:r>
     </w:p>
     <w:p>
@@ -1911,7 +1912,7 @@
           <w:sz w:val="19"/>
           <w:rFonts w:ascii="맑은 고딕" w:hAnsi="맑은 고딕" w:eastAsia="맑은 고딕"/>
         </w:rPr>
-        <w:t>파이썬 파이프라인을 통해 원시 데이터 수치 정합성을 100% 검증하여 반영했다.</w:t>
+        <w:t>데이터 분석 ➔ 페르소나 매칭 ➔ 1-Click K-굿즈 상품기획서 자동 추출로 연결되는 실현 가능한 워크플로우.</w:t>
       </w:r>
     </w:p>
     <w:p/>
@@ -1927,7 +1928,7 @@
           <w:sz w:val="28"/>
           <w:rFonts w:ascii="맑은 고딕" w:hAnsi="맑은 고딕" w:eastAsia="맑은 고딕"/>
         </w:rPr>
-        <w:t>슬라이드 13. Q&amp;A 및 마무리 (Conclusion &amp; Q&amp;A)</w:t>
+        <w:t>슬라이드 13. 핵심 제언 및 Q&amp;A (Conclusion &amp; Q&amp;A)</w:t>
       </w:r>
     </w:p>
     <w:tbl>
@@ -1970,7 +1971,7 @@
                 <w:sz w:val="19"/>
                 <w:rFonts w:ascii="맑은 고딕" w:hAnsi="맑은 고딕" w:eastAsia="맑은 고딕"/>
               </w:rPr>
-              <w:t>핵심 메시지 요약 및 "Q&amp;A / 감사합니다" 문구</w:t>
+              <w:t>4대 국가별 맞춤 상품 4종 요약 및 "K-컬처 1030 타깃에 K-굿즈를 결합하자!" 결론 문구</w:t>
             </w:r>
           </w:p>
         </w:tc>
@@ -2004,7 +2005,7 @@
                 <w:sz w:val="19"/>
                 <w:rFonts w:ascii="맑은 고딕" w:hAnsi="맑은 고딕" w:eastAsia="맑은 고딕"/>
               </w:rPr>
-              <w:t>청중을 향해 허리를 숙여 깍듯이 인사합니다.</w:t>
+              <w:t>청중을 향해 허리를 숙여 깍듯이 인사하며 밝은 표정으로 마무리합니다.</w:t>
             </w:r>
           </w:p>
         </w:tc>
@@ -2037,15 +2038,13 @@
         <w:t>“마지막 13번 슬라이드입니다.</w:t>
         <w:br/>
         <w:br/>
-        <w:t>오늘 발표의 핵심 메시지는 단 하나입니다.</w:t>
-        <w:br/>
-        <w:t>K-컬처 외래관광객은 '젊고, 짧게 머물지만, 강력하게 소비하며, 한국을 반드시 다시 찾는 최고의 고객'이라는 점입니다.</w:t>
+        <w:t>오늘 분석의 결론은 명확합니다. '1030 K-컬처 관광객에게 K-굿즈 및 맞춤 혜택을 결합한 핀포인트 여행 상품을 제공하는 것'입니다.</w:t>
         <w:br/>
         <w:br/>
-        <w:t>이들의 특성에 맞춘 고밀도 K-체험 상품과 뷰티·미식 융합 전략이 준비된다면, 2026년 대한민국 관광 산업은 한 단계 더 도약할 것입니다.</w:t>
+        <w:t>단순히 통계를 보고하는 수준을 넘어, 분석 결과를 1-Click 실무 상품 기획서로 바꿔주는 당사의 솔루션을 활용한다면, 2026년 대한민국 관광 산업은 도약할 것입니다.</w:t>
         <w:br/>
         <w:br/>
-        <w:t>이상으로 발표를 마치겠습니다. 경청해 주셔서 감사합니다. 질문이 있으시면 답변해 드리겠습니다.”</w:t>
+        <w:t>이상으로 발표를 마치겠습니다. 경청해 주셔서 감사합니다.”</w:t>
       </w:r>
     </w:p>
     <w:p>
@@ -2070,7 +2069,7 @@
           <w:sz w:val="19"/>
           <w:rFonts w:ascii="맑은 고딕" w:hAnsi="맑은 고딕" w:eastAsia="맑은 고딕"/>
         </w:rPr>
-        <w:t>K-컬처 관광객 맞춤형 전략으로 2026년 한국 관광 산업의 도약을 이끌겠다며 마무리.</w:t>
+        <w:t>K-컬처 1030 타깃에 K-굿즈 &amp; 맞춤 기획서 솔루션을 결합해 2026년 관광 성과를 극대화하자며 마무리.</w:t>
       </w:r>
     </w:p>
     <w:p/>

</xml_diff>